<commit_message>
added auth functionality and dashboard with mocks
</commit_message>
<xml_diff>
--- a/Docs/Job_Application_Tracker_Architecture.docx
+++ b/Docs/Job_Application_Tracker_Architecture.docx
@@ -20,7 +20,13 @@
     </w:p>
     <w:p>
       <w:r>
-        <w:t>Cloud-native Job Application Tracker built on AWS Free Tier using React, API Gateway, Python Lambda, Cognito, RDS MySQL, DynamoDB, S3, EventBridge, SNS, CloudWatch, and CDK.</w:t>
+        <w:t xml:space="preserve">Cloud-native Job Application Tracker built on AWS Free Tier using </w:t>
+      </w:r>
+      <w:r>
+        <w:t>Angular</w:t>
+      </w:r>
+      <w:r>
+        <w:t>, API Gateway, Python Lambda, Cognito, RDS MySQL, DynamoDB, S3, EventBridge, SNS, CloudWatch, and CDK.</w:t>
       </w:r>
     </w:p>
     <w:p>
@@ -33,7 +39,13 @@
     </w:p>
     <w:p>
       <w:r>
-        <w:t>Frontend: React hosted on S3 (+ CloudFront later).</w:t>
+        <w:t xml:space="preserve">Frontend: </w:t>
+      </w:r>
+      <w:r>
+        <w:t>Angular</w:t>
+      </w:r>
+      <w:r>
+        <w:t xml:space="preserve"> hosted on S3 (+ CloudFront later).</w:t>
       </w:r>
     </w:p>
     <w:p>
@@ -146,15 +158,15 @@
         <w:spacing w:after="0"/>
       </w:pPr>
       <w:r>
-        <w:t>React (S3 + CloudFront)</w:t>
+        <w:t>Angular</w:t>
+      </w:r>
+      <w:r>
+        <w:t xml:space="preserve"> (S3 + CloudFront)</w:t>
       </w:r>
     </w:p>
     <w:p>
       <w:pPr>
         <w:spacing w:after="0"/>
-        <w:rPr>
-          <w:rFonts w:hint="eastAsia"/>
-        </w:rPr>
       </w:pPr>
       <w:r>
         <w:rPr>
@@ -180,9 +192,6 @@
     <w:p>
       <w:pPr>
         <w:spacing w:after="0"/>
-        <w:rPr>
-          <w:rFonts w:hint="eastAsia"/>
-        </w:rPr>
       </w:pPr>
       <w:r>
         <w:rPr>
@@ -208,9 +217,6 @@
     <w:p>
       <w:pPr>
         <w:spacing w:after="0"/>
-        <w:rPr>
-          <w:rFonts w:hint="eastAsia"/>
-        </w:rPr>
       </w:pPr>
       <w:r>
         <w:rPr>
@@ -236,9 +242,6 @@
     <w:p>
       <w:pPr>
         <w:spacing w:after="0"/>
-        <w:rPr>
-          <w:rFonts w:hint="eastAsia"/>
-        </w:rPr>
       </w:pPr>
       <w:r>
         <w:rPr>
@@ -256,9 +259,6 @@
     <w:p>
       <w:pPr>
         <w:spacing w:after="0"/>
-        <w:rPr>
-          <w:rFonts w:hint="eastAsia"/>
-        </w:rPr>
       </w:pPr>
       <w:r>
         <w:rPr>
@@ -276,9 +276,6 @@
     <w:p>
       <w:pPr>
         <w:spacing w:after="0"/>
-        <w:rPr>
-          <w:rFonts w:hint="eastAsia"/>
-        </w:rPr>
       </w:pPr>
       <w:r>
         <w:rPr>
@@ -299,6 +296,9 @@
         <w:t xml:space="preserve">                     </w:t>
       </w:r>
       <w:r>
+        <w:t xml:space="preserve">                                                                          </w:t>
+      </w:r>
+      <w:r>
         <w:rPr>
           <w:rFonts w:hint="eastAsia"/>
         </w:rPr>
@@ -310,7 +310,20 @@
         <w:spacing w:after="0"/>
       </w:pPr>
       <w:r>
-        <w:t>Amazon RDS MySQL      S3</w:t>
+        <w:t xml:space="preserve">Amazon RDS MySQL      </w:t>
+      </w:r>
+      <w:r>
+        <w:tab/>
+      </w:r>
+      <w:r>
+        <w:tab/>
+      </w:r>
+      <w:r>
+        <w:tab/>
+        <w:t xml:space="preserve">          </w:t>
+      </w:r>
+      <w:r>
+        <w:t>S3</w:t>
       </w:r>
     </w:p>
     <w:p>
@@ -318,13 +331,20 @@
         <w:spacing w:after="0"/>
       </w:pPr>
       <w:r>
-        <w:t xml:space="preserve">(Application </w:t>
-      </w:r>
-      <w:proofErr w:type="gramStart"/>
-      <w:r>
-        <w:t xml:space="preserve">Data)   </w:t>
-      </w:r>
-      <w:proofErr w:type="gramEnd"/>
+        <w:t>(Application Data)</w:t>
+      </w:r>
+      <w:r>
+        <w:tab/>
+      </w:r>
+      <w:r>
+        <w:tab/>
+      </w:r>
+      <w:r>
+        <w:tab/>
+      </w:r>
+      <w:r>
+        <w:tab/>
+      </w:r>
       <w:r>
         <w:t>(Resumes)</w:t>
       </w:r>
@@ -332,9 +352,6 @@
     <w:p>
       <w:pPr>
         <w:spacing w:after="0"/>
-        <w:rPr>
-          <w:rFonts w:hint="eastAsia"/>
-        </w:rPr>
       </w:pPr>
       <w:r>
         <w:rPr>
@@ -353,16 +370,15 @@
       <w:pPr>
         <w:spacing w:after="0"/>
       </w:pPr>
-      <w:r>
-        <w:t>Secrets Manager</w:t>
-      </w:r>
+      <w:proofErr w:type="spellStart"/>
+      <w:r>
+        <w:t>EventBridge</w:t>
+      </w:r>
+      <w:proofErr w:type="spellEnd"/>
     </w:p>
     <w:p>
       <w:pPr>
         <w:spacing w:after="0"/>
-        <w:rPr>
-          <w:rFonts w:hint="eastAsia"/>
-        </w:rPr>
       </w:pPr>
       <w:r>
         <w:rPr>
@@ -381,18 +397,13 @@
       <w:pPr>
         <w:spacing w:after="0"/>
       </w:pPr>
-      <w:proofErr w:type="spellStart"/>
-      <w:r>
-        <w:t>EventBridge</w:t>
-      </w:r>
-      <w:proofErr w:type="spellEnd"/>
+      <w:r>
+        <w:t>Reminder Lambda</w:t>
+      </w:r>
     </w:p>
     <w:p>
       <w:pPr>
         <w:spacing w:after="0"/>
-        <w:rPr>
-          <w:rFonts w:hint="eastAsia"/>
-        </w:rPr>
       </w:pPr>
       <w:r>
         <w:rPr>
@@ -412,15 +423,12 @@
         <w:spacing w:after="0"/>
       </w:pPr>
       <w:r>
-        <w:t>Reminder Lambda</w:t>
+        <w:t>SNS</w:t>
       </w:r>
     </w:p>
     <w:p>
       <w:pPr>
         <w:spacing w:after="0"/>
-        <w:rPr>
-          <w:rFonts w:hint="eastAsia"/>
-        </w:rPr>
       </w:pPr>
       <w:r>
         <w:rPr>
@@ -440,21 +448,31 @@
         <w:spacing w:after="0"/>
       </w:pPr>
       <w:r>
-        <w:t>SNS</w:t>
+        <w:t>Email</w:t>
       </w:r>
     </w:p>
     <w:p>
       <w:pPr>
         <w:spacing w:after="0"/>
+      </w:pPr>
+    </w:p>
+    <w:p>
+      <w:pPr>
+        <w:spacing w:after="0"/>
+      </w:pPr>
+      <w:r>
+        <w:t>CloudWatch</w:t>
+      </w:r>
+    </w:p>
+    <w:p>
+      <w:pPr>
+        <w:spacing w:after="0"/>
+      </w:pPr>
+      <w:r>
         <w:rPr>
           <w:rFonts w:hint="eastAsia"/>
         </w:rPr>
-      </w:pPr>
-      <w:r>
-        <w:rPr>
-          <w:rFonts w:hint="eastAsia"/>
-        </w:rPr>
-        <w:t xml:space="preserve"> </w:t>
+        <w:t xml:space="preserve">    </w:t>
       </w:r>
       <w:r>
         <w:rPr>
@@ -468,7 +486,7 @@
         <w:spacing w:after="0"/>
       </w:pPr>
       <w:r>
-        <w:t>Email</w:t>
+        <w:t>Logs • Metrics • Alarms</w:t>
       </w:r>
     </w:p>
     <w:p>
@@ -481,56 +499,12 @@
         <w:spacing w:after="0"/>
       </w:pPr>
       <w:r>
-        <w:t>CloudWatch</w:t>
+        <w:t>AWS CDK</w:t>
       </w:r>
     </w:p>
     <w:p>
       <w:pPr>
         <w:spacing w:after="0"/>
-        <w:rPr>
-          <w:rFonts w:hint="eastAsia"/>
-        </w:rPr>
-      </w:pPr>
-      <w:r>
-        <w:rPr>
-          <w:rFonts w:hint="eastAsia"/>
-        </w:rPr>
-        <w:t xml:space="preserve">    </w:t>
-      </w:r>
-      <w:r>
-        <w:rPr>
-          <w:rFonts w:hint="eastAsia"/>
-        </w:rPr>
-        <w:t>│</w:t>
-      </w:r>
-    </w:p>
-    <w:p>
-      <w:pPr>
-        <w:spacing w:after="0"/>
-      </w:pPr>
-      <w:r>
-        <w:t>Logs • Metrics • Alarms</w:t>
-      </w:r>
-    </w:p>
-    <w:p>
-      <w:pPr>
-        <w:spacing w:after="0"/>
-      </w:pPr>
-    </w:p>
-    <w:p>
-      <w:pPr>
-        <w:spacing w:after="0"/>
-      </w:pPr>
-      <w:r>
-        <w:t>AWS CDK</w:t>
-      </w:r>
-    </w:p>
-    <w:p>
-      <w:pPr>
-        <w:spacing w:after="0"/>
-        <w:rPr>
-          <w:rFonts w:hint="eastAsia"/>
-        </w:rPr>
       </w:pPr>
       <w:r>
         <w:rPr>
@@ -817,7 +791,7 @@
       </w:pPr>
       <w:r>
         <w:pict w14:anchorId="42E3B694">
-          <v:rect id="_x0000_i1031" style="width:0;height:1.5pt" o:hralign="center" o:hrstd="t" o:hr="t" fillcolor="#a0a0a0" stroked="f"/>
+          <v:rect id="_x0000_i1025" style="width:0;height:1.5pt" o:hralign="center" o:hrstd="t" o:hr="t" fillcolor="#a0a0a0" stroked="f"/>
         </w:pict>
       </w:r>
     </w:p>
@@ -1026,7 +1000,10 @@
               <w:spacing w:after="0"/>
             </w:pPr>
             <w:r>
-              <w:t>React + TypeScript</w:t>
+              <w:t>Angular</w:t>
+            </w:r>
+            <w:r>
+              <w:t xml:space="preserve"> + TypeScript</w:t>
             </w:r>
           </w:p>
         </w:tc>
@@ -1398,7 +1375,7 @@
         <w:ind w:left="720"/>
       </w:pPr>
       <w:r>
-        <w:t>React</w:t>
+        <w:t>Angular</w:t>
       </w:r>
     </w:p>
     <w:p>
@@ -1414,9 +1391,6 @@
       <w:pPr>
         <w:spacing w:after="0"/>
         <w:ind w:left="360"/>
-        <w:rPr>
-          <w:rFonts w:hint="eastAsia"/>
-        </w:rPr>
       </w:pPr>
       <w:r>
         <w:rPr>
@@ -1435,9 +1409,6 @@
       <w:pPr>
         <w:spacing w:after="0"/>
         <w:ind w:left="360"/>
-        <w:rPr>
-          <w:rFonts w:hint="eastAsia"/>
-        </w:rPr>
       </w:pPr>
       <w:r>
         <w:rPr>
@@ -1482,9 +1453,6 @@
       <w:pPr>
         <w:spacing w:after="0"/>
         <w:ind w:left="360"/>
-        <w:rPr>
-          <w:rFonts w:hint="eastAsia"/>
-        </w:rPr>
       </w:pPr>
       <w:r>
         <w:rPr>
@@ -1527,9 +1495,6 @@
       <w:pPr>
         <w:spacing w:after="0"/>
         <w:ind w:left="360"/>
-        <w:rPr>
-          <w:rFonts w:hint="eastAsia"/>
-        </w:rPr>
       </w:pPr>
       <w:r>
         <w:rPr>
@@ -1572,9 +1537,6 @@
       <w:pPr>
         <w:spacing w:after="0"/>
         <w:ind w:left="360"/>
-        <w:rPr>
-          <w:rFonts w:hint="eastAsia"/>
-        </w:rPr>
       </w:pPr>
       <w:r>
         <w:rPr>
@@ -1619,9 +1581,6 @@
       <w:pPr>
         <w:spacing w:after="0"/>
         <w:ind w:left="360"/>
-        <w:rPr>
-          <w:rFonts w:hint="eastAsia"/>
-        </w:rPr>
       </w:pPr>
       <w:r>
         <w:rPr>
@@ -1666,9 +1625,6 @@
       <w:pPr>
         <w:spacing w:after="0"/>
         <w:ind w:left="360"/>
-        <w:rPr>
-          <w:rFonts w:hint="eastAsia"/>
-        </w:rPr>
       </w:pPr>
       <w:r>
         <w:rPr>
@@ -1713,9 +1669,6 @@
       <w:pPr>
         <w:spacing w:after="0"/>
         <w:ind w:left="360"/>
-        <w:rPr>
-          <w:rFonts w:hint="eastAsia"/>
-        </w:rPr>
       </w:pPr>
       <w:r>
         <w:rPr>
@@ -1760,9 +1713,6 @@
       <w:pPr>
         <w:spacing w:after="0"/>
         <w:ind w:left="360"/>
-        <w:rPr>
-          <w:rFonts w:hint="eastAsia"/>
-        </w:rPr>
       </w:pPr>
       <w:r>
         <w:rPr>
@@ -1793,9 +1743,6 @@
       <w:pPr>
         <w:spacing w:after="0"/>
         <w:ind w:left="360"/>
-        <w:rPr>
-          <w:rFonts w:hint="eastAsia"/>
-        </w:rPr>
       </w:pPr>
       <w:r>
         <w:rPr>
@@ -1808,9 +1755,6 @@
       <w:pPr>
         <w:spacing w:after="0"/>
         <w:ind w:left="360"/>
-        <w:rPr>
-          <w:rFonts w:hint="eastAsia"/>
-        </w:rPr>
       </w:pPr>
       <w:r>
         <w:rPr>
@@ -1829,9 +1773,6 @@
       <w:pPr>
         <w:spacing w:after="0"/>
         <w:ind w:left="360"/>
-        <w:rPr>
-          <w:rFonts w:hint="eastAsia"/>
-        </w:rPr>
       </w:pPr>
       <w:r>
         <w:rPr>
@@ -1862,9 +1803,6 @@
       <w:pPr>
         <w:spacing w:after="0"/>
         <w:ind w:left="360"/>
-        <w:rPr>
-          <w:rFonts w:hint="eastAsia"/>
-        </w:rPr>
       </w:pPr>
       <w:r>
         <w:rPr>
@@ -1895,9 +1833,6 @@
       <w:pPr>
         <w:spacing w:after="0"/>
         <w:ind w:left="360"/>
-        <w:rPr>
-          <w:rFonts w:hint="eastAsia"/>
-        </w:rPr>
       </w:pPr>
       <w:r>
         <w:rPr>
@@ -1928,9 +1863,6 @@
       <w:pPr>
         <w:spacing w:after="0"/>
         <w:ind w:left="360"/>
-        <w:rPr>
-          <w:rFonts w:hint="eastAsia"/>
-        </w:rPr>
       </w:pPr>
       <w:r>
         <w:rPr>
@@ -1961,9 +1893,6 @@
       <w:pPr>
         <w:spacing w:after="0"/>
         <w:ind w:left="360"/>
-        <w:rPr>
-          <w:rFonts w:hint="eastAsia"/>
-        </w:rPr>
       </w:pPr>
       <w:r>
         <w:rPr>
@@ -3161,6 +3090,7 @@
   <w:style w:type="character" w:default="1" w:styleId="DefaultParagraphFont">
     <w:name w:val="Default Paragraph Font"/>
     <w:uiPriority w:val="1"/>
+    <w:semiHidden/>
     <w:unhideWhenUsed/>
   </w:style>
   <w:style w:type="table" w:default="1" w:styleId="TableNormal">

</xml_diff>